<commit_message>
fix: refine case study document rail and mobile lightbox layout
</commit_message>
<xml_diff>
--- a/public/assets/case-studies/northstar-flexline-product-launch/01-analyze/02-content-gap-analysis/content-gap-analysis.docx
+++ b/public/assets/case-studies/northstar-flexline-product-launch/01-analyze/02-content-gap-analysis/content-gap-analysis.docx
@@ -982,7 +982,49 @@
           <w:rFonts w:ascii="Source Sans Pro Light" w:hAnsi="Source Sans Pro Light"/>
           <w:color w:val="000000" w:themeColor="background1"/>
         </w:rPr>
-        <w:t>Credit lines from $1,000–$150,000</w:t>
+        <w:t>Credit lines from $</w:t>
+      </w:r>
+      <w:r>
+        <w:rPr>
+          <w:rFonts w:ascii="Source Sans Pro Light" w:hAnsi="Source Sans Pro Light"/>
+          <w:color w:val="000000" w:themeColor="background1"/>
+        </w:rPr>
+        <w:t>2</w:t>
+      </w:r>
+      <w:r>
+        <w:rPr>
+          <w:rFonts w:ascii="Source Sans Pro Light" w:hAnsi="Source Sans Pro Light"/>
+          <w:color w:val="000000" w:themeColor="background1"/>
+        </w:rPr>
+        <w:t>,</w:t>
+      </w:r>
+      <w:r>
+        <w:rPr>
+          <w:rFonts w:ascii="Source Sans Pro Light" w:hAnsi="Source Sans Pro Light"/>
+          <w:color w:val="000000" w:themeColor="background1"/>
+        </w:rPr>
+        <w:t>5</w:t>
+      </w:r>
+      <w:r>
+        <w:rPr>
+          <w:rFonts w:ascii="Source Sans Pro Light" w:hAnsi="Source Sans Pro Light"/>
+          <w:color w:val="000000" w:themeColor="background1"/>
+        </w:rPr>
+        <w:t>00–$1</w:t>
+      </w:r>
+      <w:r>
+        <w:rPr>
+          <w:rFonts w:ascii="Source Sans Pro Light" w:hAnsi="Source Sans Pro Light"/>
+          <w:color w:val="000000" w:themeColor="background1"/>
+        </w:rPr>
+        <w:t>25</w:t>
+      </w:r>
+      <w:r>
+        <w:rPr>
+          <w:rFonts w:ascii="Source Sans Pro Light" w:hAnsi="Source Sans Pro Light"/>
+          <w:color w:val="000000" w:themeColor="background1"/>
+        </w:rPr>
+        <w:t>,000</w:t>
       </w:r>
     </w:p>
     <w:p>
@@ -1022,7 +1064,35 @@
           <w:rFonts w:ascii="Source Sans Pro Light" w:hAnsi="Source Sans Pro Light"/>
           <w:color w:val="000000" w:themeColor="background1"/>
         </w:rPr>
-        <w:t>Repayment terms: 12 or 24 weeks per draw, fixed weekly payments</w:t>
+        <w:t>Repayment terms: 1</w:t>
+      </w:r>
+      <w:r>
+        <w:rPr>
+          <w:rFonts w:ascii="Source Sans Pro Light" w:hAnsi="Source Sans Pro Light"/>
+          <w:color w:val="000000" w:themeColor="background1"/>
+        </w:rPr>
+        <w:t>6</w:t>
+      </w:r>
+      <w:r>
+        <w:rPr>
+          <w:rFonts w:ascii="Source Sans Pro Light" w:hAnsi="Source Sans Pro Light"/>
+          <w:color w:val="000000" w:themeColor="background1"/>
+        </w:rPr>
+        <w:t xml:space="preserve"> or 2</w:t>
+      </w:r>
+      <w:r>
+        <w:rPr>
+          <w:rFonts w:ascii="Source Sans Pro Light" w:hAnsi="Source Sans Pro Light"/>
+          <w:color w:val="000000" w:themeColor="background1"/>
+        </w:rPr>
+        <w:t>6</w:t>
+      </w:r>
+      <w:r>
+        <w:rPr>
+          <w:rFonts w:ascii="Source Sans Pro Light" w:hAnsi="Source Sans Pro Light"/>
+          <w:color w:val="000000" w:themeColor="background1"/>
+        </w:rPr>
+        <w:t xml:space="preserve"> weeks per draw, fixed weekly payments</w:t>
       </w:r>
     </w:p>
     <w:p>
@@ -1106,7 +1176,21 @@
           <w:rFonts w:ascii="Source Sans Pro Light" w:hAnsi="Source Sans Pro Light"/>
           <w:color w:val="000000" w:themeColor="background1"/>
         </w:rPr>
-        <w:t>Business operating for 6+ months</w:t>
+        <w:t xml:space="preserve">Business operating for </w:t>
+      </w:r>
+      <w:r>
+        <w:rPr>
+          <w:rFonts w:ascii="Source Sans Pro Light" w:hAnsi="Source Sans Pro Light"/>
+          <w:color w:val="000000" w:themeColor="background1"/>
+        </w:rPr>
+        <w:t>9</w:t>
+      </w:r>
+      <w:r>
+        <w:rPr>
+          <w:rFonts w:ascii="Source Sans Pro Light" w:hAnsi="Source Sans Pro Light"/>
+          <w:color w:val="000000" w:themeColor="background1"/>
+        </w:rPr>
+        <w:t>+ months</w:t>
       </w:r>
     </w:p>
     <w:p>
@@ -1126,7 +1210,21 @@
           <w:rFonts w:ascii="Source Sans Pro Light" w:hAnsi="Source Sans Pro Light"/>
           <w:color w:val="000000" w:themeColor="background1"/>
         </w:rPr>
-        <w:t>Minimum $100,000 in annual revenue</w:t>
+        <w:t>Minimum $1</w:t>
+      </w:r>
+      <w:r>
+        <w:rPr>
+          <w:rFonts w:ascii="Source Sans Pro Light" w:hAnsi="Source Sans Pro Light"/>
+          <w:color w:val="000000" w:themeColor="background1"/>
+        </w:rPr>
+        <w:t>2</w:t>
+      </w:r>
+      <w:r>
+        <w:rPr>
+          <w:rFonts w:ascii="Source Sans Pro Light" w:hAnsi="Source Sans Pro Light"/>
+          <w:color w:val="000000" w:themeColor="background1"/>
+        </w:rPr>
+        <w:t>0,000 in annual revenue</w:t>
       </w:r>
     </w:p>
     <w:p>
@@ -1220,43 +1318,14 @@
           <w:rFonts w:ascii="Source Sans Pro Light" w:hAnsi="Source Sans Pro Light"/>
           <w:color w:val="000000" w:themeColor="background1"/>
         </w:rPr>
-        <w:t xml:space="preserve">Fees are draw-based, not a flat APR — displayed as a total fee for the draw term at the time of the </w:t>
-      </w:r>
-      <w:proofErr w:type="gramStart"/>
-      <w:r>
-        <w:rPr>
-          <w:rFonts w:ascii="Source Sans Pro Light" w:hAnsi="Source Sans Pro Light"/>
-          <w:color w:val="000000" w:themeColor="background1"/>
-        </w:rPr>
-        <w:t>draw</w:t>
-      </w:r>
-      <w:proofErr w:type="gramEnd"/>
+        <w:t>Fees are draw-based, not a flat APR — displayed as a total fee for the draw term at the time of the draw</w:t>
+      </w:r>
       <w:r>
         <w:rPr>
           <w:rFonts w:ascii="Source Sans Pro Light" w:hAnsi="Source Sans Pro Light"/>
           <w:color w:val="000000" w:themeColor="background1"/>
         </w:rPr>
         <w:t>.</w:t>
-      </w:r>
-    </w:p>
-    <w:p>
-      <w:pPr>
-        <w:pStyle w:val="ListParagraph"/>
-        <w:numPr>
-          <w:ilvl w:val="0"/>
-          <w:numId w:val="38"/>
-        </w:numPr>
-        <w:rPr>
-          <w:rFonts w:ascii="Source Sans Pro Light" w:hAnsi="Source Sans Pro Light"/>
-          <w:color w:val="000000" w:themeColor="background1"/>
-        </w:rPr>
-      </w:pPr>
-      <w:r>
-        <w:rPr>
-          <w:rFonts w:ascii="Source Sans Pro Light" w:hAnsi="Source Sans Pro Light"/>
-          <w:color w:val="000000" w:themeColor="background1"/>
-        </w:rPr>
-        <w:t>Typical fee range: 4.66%–8.99% of the draw amount for a 12-week term</w:t>
       </w:r>
     </w:p>
     <w:p>

</xml_diff>